<commit_message>
Fiches des quatre nouvelles activités : en-tête des fiches de projet (logo, séquence, n° d'activité, QR)
Co-Authored-By: Claude Opus 5.5 <noreply@anthropic.com>
Claude-Session: https://claude.ai/code/session_01HsnP9r4W3zuFq76mxfPWJu
</commit_message>
<xml_diff>
--- a/public/2026/projets/EBEP_S5-A03bis_Planifier_5eme.docx
+++ b/public/2026/projets/EBEP_S5-A03bis_Planifier_5eme.docx
@@ -15,9 +15,10 @@
         </w:tblBorders>
       </w:tblPr>
       <w:tblGrid>
-        <w:gridCol w:w="1150"/>
-        <w:gridCol w:w="7916"/>
-        <w:gridCol w:w="1400"/>
+        <w:gridCol w:w="1300"/>
+        <w:gridCol w:w="4200"/>
+        <w:gridCol w:w="3666"/>
+        <w:gridCol w:w="1300"/>
       </w:tblGrid>
       <w:tr>
         <w:trPr>
@@ -25,26 +26,29 @@
         </w:trPr>
         <w:tc>
           <w:tcPr>
-            <w:tcW w:type="dxa" w:w="1150"/>
-            <w:tcBorders>
-              <w:top w:val="none" w:color="FFFFFF" w:sz="0"/>
-              <w:left w:val="none" w:color="FFFFFF" w:sz="0"/>
-              <w:bottom w:val="single" w:color="11223D" w:sz="12"/>
-              <w:right w:val="none" w:color="FFFFFF" w:sz="0"/>
-            </w:tcBorders>
-            <w:tcMar>
-              <w:top w:type="dxa" w:w="40"/>
-              <w:left w:type="dxa" w:w="110"/>
-              <w:bottom w:type="dxa" w:w="40"/>
-              <w:right w:type="dxa" w:w="110"/>
-            </w:tcMar>
-            <w:vAlign w:val="center"/>
-          </w:tcPr>
-          <w:p>
+            <w:tcW w:type="dxa" w:w="1300"/>
+            <w:tcBorders>
+              <w:top w:val="single" w:color="000000" w:sz="6"/>
+              <w:left w:val="single" w:color="000000" w:sz="6"/>
+              <w:bottom w:val="single" w:color="000000" w:sz="6"/>
+              <w:right w:val="single" w:color="000000" w:sz="6"/>
+            </w:tcBorders>
+            <w:tcMar>
+              <w:top w:type="dxa" w:w="60"/>
+              <w:left w:type="dxa" w:w="110"/>
+              <w:bottom w:type="dxa" w:w="60"/>
+              <w:right w:type="dxa" w:w="110"/>
+            </w:tcMar>
+            <w:vAlign w:val="center"/>
+          </w:tcPr>
+          <w:p>
+            <w:pPr>
+              <w:jc w:val="center"/>
+            </w:pPr>
             <w:r>
               <w:drawing>
                 <wp:inline distT="0" distB="0" distL="0" distR="0">
-                  <wp:extent cx="495300" cy="381000"/>
+                  <wp:extent cx="590550" cy="457200"/>
                   <wp:effectExtent t="0" r="0" b="0" l="0"/>
                   <wp:docPr id="1" name="" descr="" title=""/>
                   <wp:cNvGraphicFramePr>
@@ -69,7 +73,7 @@
                         <pic:spPr bwMode="auto">
                           <a:xfrm>
                             <a:off x="0" y="0"/>
-                            <a:ext cx="495300" cy="381000"/>
+                            <a:ext cx="590550" cy="457200"/>
                           </a:xfrm>
                           <a:prstGeom prst="rect">
                             <a:avLst/>
@@ -85,88 +89,162 @@
         </w:tc>
         <w:tc>
           <w:tcPr>
-            <w:tcW w:type="dxa" w:w="7916"/>
-            <w:tcBorders>
-              <w:top w:val="none" w:color="FFFFFF" w:sz="0"/>
-              <w:left w:val="none" w:color="FFFFFF" w:sz="0"/>
-              <w:bottom w:val="single" w:color="11223D" w:sz="12"/>
-              <w:right w:val="none" w:color="FFFFFF" w:sz="0"/>
-            </w:tcBorders>
-            <w:tcMar>
-              <w:top w:type="dxa" w:w="40"/>
-              <w:left w:type="dxa" w:w="110"/>
-              <w:bottom w:type="dxa" w:w="40"/>
-              <w:right w:type="dxa" w:w="110"/>
-            </w:tcMar>
-            <w:vAlign w:val="center"/>
-          </w:tcPr>
-          <w:p>
-            <w:pPr>
-              <w:keepLines/>
-              <w:spacing w:after="30" w:before="0"/>
+            <w:tcW w:type="dxa" w:w="4200"/>
+            <w:tcBorders>
+              <w:top w:val="single" w:color="000000" w:sz="6"/>
+              <w:left w:val="single" w:color="000000" w:sz="6"/>
+              <w:bottom w:val="single" w:color="000000" w:sz="6"/>
+              <w:right w:val="single" w:color="000000" w:sz="6"/>
+            </w:tcBorders>
+            <w:tcMar>
+              <w:top w:type="dxa" w:w="60"/>
+              <w:left w:type="dxa" w:w="110"/>
+              <w:bottom w:type="dxa" w:w="60"/>
+              <w:right w:type="dxa" w:w="110"/>
+            </w:tcMar>
+            <w:vAlign w:val="center"/>
+          </w:tcPr>
+          <w:p>
+            <w:pPr>
+              <w:keepLines/>
+              <w:spacing w:after="20" w:before="0"/>
+              <w:jc w:val="center"/>
             </w:pPr>
             <w:r>
               <w:rPr>
                 <w:rFonts w:ascii="Arial" w:cs="Arial" w:eastAsia="Arial" w:hAnsi="Arial"/>
                 <w:b/>
                 <w:bCs/>
-                <w:color w:val="11223D"/>
-                <w:sz w:val="17"/>
-                <w:szCs w:val="17"/>
-              </w:rPr>
-              <w:t xml:space="preserve">TECHNOLOGIE · 5ᵉ   ·   PROJET — LE PONT EN UNE FEUILLE A4   ·   ACTIVITÉ 3 bis</w:t>
-            </w:r>
-            <w:r>
-              <w:rPr>
-                <w:rFonts w:ascii="Arial" w:cs="Arial" w:eastAsia="Arial" w:hAnsi="Arial"/>
-                <w:color w:val="5B6675"/>
-                <w:sz w:val="17"/>
-                <w:szCs w:val="17"/>
-              </w:rPr>
-              <w:t xml:space="preserve">   ·   version adaptée</w:t>
-            </w:r>
-          </w:p>
-          <w:p>
-            <w:pPr>
-              <w:keepLines/>
-              <w:spacing w:after="0" w:before="0"/>
-            </w:pPr>
-            <w:r>
-              <w:rPr>
-                <w:rFonts w:ascii="Arial" w:cs="Arial" w:eastAsia="Arial" w:hAnsi="Arial"/>
-                <w:color w:val="5B6675"/>
+                <w:color w:val="000000"/>
+                <w:sz w:val="18"/>
+                <w:szCs w:val="18"/>
+              </w:rPr>
+              <w:t xml:space="preserve">ACADÉMIE TECHNOLOGIQUE</w:t>
+            </w:r>
+          </w:p>
+          <w:p>
+            <w:pPr>
+              <w:keepLines/>
+              <w:spacing w:after="0" w:before="0"/>
+              <w:jc w:val="center"/>
+            </w:pPr>
+            <w:r>
+              <w:rPr>
+                <w:rFonts w:ascii="Arial" w:cs="Arial" w:eastAsia="Arial" w:hAnsi="Arial"/>
+                <w:color w:val="000000"/>
                 <w:sz w:val="15"/>
                 <w:szCs w:val="15"/>
               </w:rPr>
-              <w:t xml:space="preserve">Académie technologique · Salle 207 TEC 3</w:t>
-            </w:r>
-          </w:p>
-        </w:tc>
-        <w:tc>
-          <w:tcPr>
-            <w:tcW w:type="dxa" w:w="1400"/>
-            <w:tcBorders>
-              <w:top w:val="none" w:color="FFFFFF" w:sz="0"/>
-              <w:left w:val="none" w:color="FFFFFF" w:sz="0"/>
-              <w:bottom w:val="single" w:color="11223D" w:sz="12"/>
-              <w:right w:val="none" w:color="FFFFFF" w:sz="0"/>
-            </w:tcBorders>
-            <w:tcMar>
-              <w:top w:type="dxa" w:w="40"/>
-              <w:left w:type="dxa" w:w="110"/>
-              <w:bottom w:type="dxa" w:w="40"/>
-              <w:right w:type="dxa" w:w="110"/>
-            </w:tcMar>
-            <w:vAlign w:val="center"/>
-          </w:tcPr>
-          <w:p>
-            <w:pPr>
-              <w:jc w:val="right"/>
+              <w:t xml:space="preserve">Technologie — Classe de 5ème</w:t>
+            </w:r>
+          </w:p>
+          <w:p>
+            <w:pPr>
+              <w:keepLines/>
+              <w:spacing w:after="0" w:before="0"/>
+              <w:jc w:val="center"/>
+            </w:pPr>
+            <w:r>
+              <w:rPr>
+                <w:rFonts w:ascii="Arial" w:cs="Arial" w:eastAsia="Arial" w:hAnsi="Arial"/>
+                <w:color w:val="000000"/>
+                <w:sz w:val="15"/>
+                <w:szCs w:val="15"/>
+              </w:rPr>
+              <w:t xml:space="preserve">Salle 207 TEC 3</w:t>
+            </w:r>
+          </w:p>
+        </w:tc>
+        <w:tc>
+          <w:tcPr>
+            <w:tcW w:type="dxa" w:w="3666"/>
+            <w:tcBorders>
+              <w:top w:val="single" w:color="000000" w:sz="6"/>
+              <w:left w:val="single" w:color="000000" w:sz="6"/>
+              <w:bottom w:val="single" w:color="000000" w:sz="6"/>
+              <w:right w:val="single" w:color="000000" w:sz="6"/>
+            </w:tcBorders>
+            <w:tcMar>
+              <w:top w:type="dxa" w:w="60"/>
+              <w:left w:type="dxa" w:w="110"/>
+              <w:bottom w:type="dxa" w:w="60"/>
+              <w:right w:type="dxa" w:w="110"/>
+            </w:tcMar>
+            <w:vAlign w:val="center"/>
+          </w:tcPr>
+          <w:p>
+            <w:pPr>
+              <w:keepLines/>
+              <w:spacing w:after="10" w:before="0"/>
+            </w:pPr>
+            <w:r>
+              <w:rPr>
+                <w:rFonts w:ascii="Arial" w:cs="Arial" w:eastAsia="Arial" w:hAnsi="Arial"/>
+                <w:b/>
+                <w:bCs/>
+                <w:color w:val="000000"/>
+                <w:sz w:val="15"/>
+                <w:szCs w:val="15"/>
+              </w:rPr>
+              <w:t xml:space="preserve">PROJET 5ème — LE PONT A4</w:t>
+            </w:r>
+          </w:p>
+          <w:p>
+            <w:pPr>
+              <w:keepLines/>
+              <w:spacing w:after="10" w:before="0"/>
+            </w:pPr>
+            <w:r>
+              <w:rPr>
+                <w:rFonts w:ascii="Arial" w:cs="Arial" w:eastAsia="Arial" w:hAnsi="Arial"/>
+                <w:color w:val="000000"/>
+                <w:sz w:val="15"/>
+                <w:szCs w:val="15"/>
+              </w:rPr>
+              <w:t xml:space="preserve">ACTIVITÉ N°03 bis · EBEP</w:t>
+            </w:r>
+          </w:p>
+          <w:p>
+            <w:pPr>
+              <w:keepLines/>
+              <w:spacing w:after="0" w:before="0"/>
+            </w:pPr>
+            <w:r>
+              <w:rPr>
+                <w:rFonts w:ascii="Arial" w:cs="Arial" w:eastAsia="Arial" w:hAnsi="Arial"/>
+                <w:color w:val="000000"/>
+                <w:sz w:val="15"/>
+                <w:szCs w:val="15"/>
+              </w:rPr>
+              <w:t xml:space="preserve">Planifier la fabrication</w:t>
+            </w:r>
+          </w:p>
+        </w:tc>
+        <w:tc>
+          <w:tcPr>
+            <w:tcW w:type="dxa" w:w="1300"/>
+            <w:tcBorders>
+              <w:top w:val="single" w:color="000000" w:sz="6"/>
+              <w:left w:val="single" w:color="000000" w:sz="6"/>
+              <w:bottom w:val="single" w:color="000000" w:sz="6"/>
+              <w:right w:val="single" w:color="000000" w:sz="6"/>
+            </w:tcBorders>
+            <w:tcMar>
+              <w:top w:type="dxa" w:w="60"/>
+              <w:left w:type="dxa" w:w="110"/>
+              <w:bottom w:type="dxa" w:w="60"/>
+              <w:right w:type="dxa" w:w="110"/>
+            </w:tcMar>
+            <w:vAlign w:val="center"/>
+          </w:tcPr>
+          <w:p>
+            <w:pPr>
+              <w:jc w:val="center"/>
             </w:pPr>
             <w:r>
               <w:drawing>
                 <wp:inline distT="0" distB="0" distL="0" distR="0">
-                  <wp:extent cx="476250" cy="476250"/>
+                  <wp:extent cx="533400" cy="533400"/>
                   <wp:effectExtent t="0" r="0" b="0" l="0"/>
                   <wp:docPr id="1" name="" descr="" title=""/>
                   <wp:cNvGraphicFramePr>
@@ -191,7 +269,7 @@
                         <pic:spPr bwMode="auto">
                           <a:xfrm>
                             <a:off x="0" y="0"/>
-                            <a:ext cx="476250" cy="476250"/>
+                            <a:ext cx="533400" cy="533400"/>
                           </a:xfrm>
                           <a:prstGeom prst="rect">
                             <a:avLst/>

</xml_diff>